<commit_message>
chore(duas-partes): sem incentivo a pagar tudo por omissão
O Ricardo desligou o Flex incluído para quem paga tudo (28 out): o Flex
é um extra pago e dá-lo sem o hóspede pedir tirava-lhe o valor; quando
o hóspede já o tinha escolhido, o total mudava sem se perceber porquê.

- FULL_PAYMENT_INCENTIVE: "none" passa a ser o valor por omissão e o de
  qualquer valor desconhecido; "flex" volta a ligar a opção A. Produção
  já está com FULL_PAYMENT_INCENTIVE=none no Render desde as 23:22 UTC.
- Demo do checkout (?twoParts=1): sem Flex incluído e com as datas da
  regra real para o check-in da demo (antes, a 2.ª cobrança caía depois
  da chegada e não batia com a frase do passo 1).
- Pacote jurídico do André: a cláusula A perde a frase do Flex incluído.
- Spec 2.6: estado a 28 out (opção C).

Co-Authored-By: Claude Opus 5.5 <noreply@anthropic.com>
</commit_message>
<xml_diff>
--- a/docs/Revisao_juridica_pagamento_duas_partes.docx
+++ b/docs/Revisao_juridica_pagamento_duas_partes.docx
@@ -32,10 +32,10 @@
         <w:rPr>
           <w:b/>
         </w:rPr>
-        <w:t>O incentivo a pagar tudo deixou de ser o desconto de 1%.</w:t>
+        <w:t>Não há incentivo a pagar tudo.</w:t>
       </w:r>
       <w:r>
-        <w:t xml:space="preserve"> Quem paga tudo agora recebe o Flex incluído (a proteção de remarcação que já vendemos). Por isso a frase do 1% sai das CGV e entra uma frase sobre o Flex incluído (cláusula A abaixo).</w:t>
+        <w:t xml:space="preserve"> O desconto de 1% foi abandonado e a alternativa (o Flex incluído para quem paga tudo) foi desligada a 28 de outubro: o hóspede escolhe só quando paga, sempre ao mesmo preço. A frase do 1% sai das CGV e não entra nenhuma outra (cláusula A abaixo). O Flex continua a ser um extra pago, que o hóspede escolhe.</w:t>
       </w:r>
     </w:p>
     <w:p>
@@ -89,7 +89,7 @@
         <w:t>O hóspede fica a saber antes do checkout.</w:t>
       </w:r>
       <w:r>
-        <w:t xml:space="preserve"> Na página da casa e no 1.º passo aparece uma frase como "Pode pagar em duas partes: metade hoje, metade a 7 de dezembro. Ou tudo agora, com o Flex incluído." Não é uma oferta com prazo nem uma promoção: é a modalidade de pagamento disponível para aquela estadia.</w:t>
+        <w:t xml:space="preserve"> Na página da casa e no 1.º passo aparece uma frase como "Pode pagar em duas partes: metade hoje, metade a 7 de dezembro." Não é uma oferta com prazo nem uma promoção: é a modalidade de pagamento disponível para aquela estadia.</w:t>
       </w:r>
     </w:p>
     <w:p>
@@ -105,7 +105,7 @@
         <w:pStyle w:val="ListBullet"/>
       </w:pPr>
       <w:r>
-        <w:t>☐ Cláusula A (Preço e pagamento), com o Flex em vez do 1%.</w:t>
+        <w:t>☐ Cláusula A (Preço e pagamento), sem a frase do 1%.</w:t>
       </w:r>
     </w:p>
     <w:p>
@@ -179,21 +179,13 @@
         <w:rPr>
           <w:i/>
         </w:rPr>
-        <w:t>(alterada: sai o 1%, entra o Flex incluído)</w:t>
+        <w:t>(alterada: sai a frase do 1%)</w:t>
       </w:r>
       <w:r/>
     </w:p>
     <w:p>
       <w:r>
-        <w:t>"O preço da estadia pode ser pago numa só vez ou em duas partes, conforme a opção escolhida na reserva. Na opção em duas partes, paga metade do valor da estadia e a totalidade dos serviços escolhidos no momento da reserva, e a outra metade da estadia na data indicada no resumo da reserva e no email de confirmação, sempre antes do fim do prazo de cancelamento gratuito. Ambos os pagamentos são pagamentos parciais do preço e não têm natureza de sinal. Quando a estadia é paga na totalidade no momento da reserva com cartão, Apple Pay ou Google Pay, o serviço Flex fica incluído sem custo, nas condições do Flex indicadas antes do pagamento. A opção em duas partes é ao preço apresentado, sem qualquer acréscimo."</w:t>
-      </w:r>
-    </w:p>
-    <w:p>
-      <w:pPr>
-        <w:ind w:left="360"/>
-      </w:pPr>
-      <w:r>
-        <w:t>Nota: hoje o Flex incluído não se aplica a Klarna e PayPal. Se quiser uma redação neutra quanto ao método, dizemos-lhe e alinhamos o site.</w:t>
+        <w:t>"O preço da estadia pode ser pago numa só vez ou em duas partes, conforme a opção escolhida na reserva. Na opção em duas partes, paga metade do valor da estadia e a totalidade dos serviços escolhidos no momento da reserva, e a outra metade da estadia na data indicada no resumo da reserva e no email de confirmação, sempre antes do fim do prazo de cancelamento gratuito. Ambos os pagamentos são pagamentos parciais do preço e não têm natureza de sinal. A opção em duas partes é ao preço apresentado, sem qualquer acréscimo."</w:t>
       </w:r>
     </w:p>
     <w:p>

</xml_diff>